<commit_message>
Update downloadable resume assets
</commit_message>
<xml_diff>
--- a/assets/resume/jeremy-fontenot-resume.docx
+++ b/assets/resume/jeremy-fontenot-resume.docx
@@ -4,19 +4,11 @@
   <w:body>
     <w:p>
       <w:pPr>
+        <w:pStyle w:val="ResumeName"/>
         <w:jc w:val="center"/>
-        <w:pBdr>
-          <w:bottom w:val="single" w:sz="6" w:space="1" w:color="0BA8D8"/>
-        </w:pBdr>
       </w:pPr>
       <w:r>
-        <w:rPr>
-          <w:rFonts w:ascii="Arial" w:hAnsi="Arial" w:eastAsia="Arial"/>
-          <w:b/>
-          <w:color w:val="111827"/>
-          <w:sz w:val="30"/>
-        </w:rPr>
-        <w:t>JEREMY FONTENOT</w:t>
+        <w:t>JEREMY C. FONTENOT</w:t>
       </w:r>
     </w:p>
     <w:p>
@@ -25,18 +17,32 @@
       </w:pPr>
       <w:r>
         <w:rPr>
-          <w:rFonts w:ascii="Arial" w:hAnsi="Arial" w:eastAsia="Arial"/>
-          <w:color w:val="4B5563"/>
-          <w:sz w:val="16"/>
+          <w:b/>
         </w:rPr>
-        <w:t>Abbeville, LA | 337-398-9327 | jeremy.fontenot@jeremyfontenot.online</w:t>
-        <w:br/>
-        <w:t>Portfolio: https://jeremyfontenot.online | LinkedIn: https://www.linkedin.com/in/jeremy-fontenot-b1537a264/</w:t>
+        <w:t>IT Service Desk | Windows Systems Administration | Microsoft 365 &amp; Entra</w:t>
       </w:r>
     </w:p>
     <w:p>
       <w:pPr>
-        <w:pStyle w:val="Heading1"/>
+        <w:jc w:val="center"/>
+      </w:pPr>
+      <w:r>
+        <w:rPr>
+          <w:sz w:val="17"/>
+        </w:rPr>
+        <w:t>Abbeville, Louisiana  |  jeremyfontenot.online  |  linkedin.com/in/jeremy-fontenot  |  github.com/fontenotjeremy71-hub</w:t>
+      </w:r>
+    </w:p>
+    <w:p>
+      <w:pPr>
+        <w:pBdr>
+          <w:bottom w:val="single" w:sz="8" w:space="1" w:color="1F4E79"/>
+        </w:pBdr>
+      </w:pPr>
+    </w:p>
+    <w:p>
+      <w:pPr>
+        <w:pStyle w:val="ResumeHeading"/>
       </w:pPr>
       <w:r>
         <w:t>PROFESSIONAL SUMMARY</w:t>
@@ -44,15 +50,669 @@
     </w:p>
     <w:p>
       <w:r>
-        <w:t>Experienced Service Desk Technician and IT Support Professional with enterprise support experience across managed service provider (MSP), healthcare, and retail environments. Proven record supporting Windows, macOS, Microsoft 365, identity access, SaaS, endpoint, and network-connectivity issues while maintaining SLA discipline, clear escalation notes, and customer-focused communication. Building Systems Administration and Infrastructure Operations capability through documented labs, PowerShell automation, Microsoft 365 and Entra ID validation records, infrastructure runbooks, and proof-linked project artifacts.</w:t>
+        <w:t>IT support professional with enterprise Service Desk experience and hands-on Windows infrastructure administration. Professional experience includes serving as the sole internal IT resource for a startup, where I built its initial on-premises Windows environment, deployed Active Directory Domain Services, configured Cloudflare DNS, and established Microsoft 365 services. Current focus is advancing into Windows Systems Administration through production support, PowerShell, Microsoft 365/Entra, Intune, virtualization, and an evidence-backed home lab.</w:t>
       </w:r>
     </w:p>
     <w:p>
       <w:pPr>
-        <w:pStyle w:val="Heading1"/>
+        <w:pStyle w:val="ResumeHeading"/>
       </w:pPr>
       <w:r>
-        <w:t>TECHNICAL SKILLS</w:t>
+        <w:t>CORE SKILLS</w:t>
+      </w:r>
+    </w:p>
+    <w:p>
+      <w:pPr>
+        <w:spacing w:after="20"/>
+      </w:pPr>
+      <w:r>
+        <w:rPr>
+          <w:b/>
+        </w:rPr>
+        <w:t xml:space="preserve">Microsoft: </w:t>
+      </w:r>
+      <w:r>
+        <w:t>Active Directory Domain Services (AD DS), Group Policy, Windows Server, Microsoft 365, Microsoft Entra ID, Intune, Windows Autopilot, Azure Arc</w:t>
+      </w:r>
+    </w:p>
+    <w:p>
+      <w:pPr>
+        <w:spacing w:after="20"/>
+      </w:pPr>
+      <w:r>
+        <w:rPr>
+          <w:b/>
+        </w:rPr>
+        <w:t xml:space="preserve">Administration: </w:t>
+      </w:r>
+      <w:r>
+        <w:t>User/group administration, authentication, permissions, workstation integration, DNS, DHCP, account lifecycle, endpoint support</w:t>
+      </w:r>
+    </w:p>
+    <w:p>
+      <w:pPr>
+        <w:spacing w:after="20"/>
+      </w:pPr>
+      <w:r>
+        <w:rPr>
+          <w:b/>
+        </w:rPr>
+        <w:t xml:space="preserve">Support &amp; ITSM: </w:t>
+      </w:r>
+      <w:r>
+        <w:t>Service Desk, incident triage, troubleshooting, escalation, knowledge documentation, Ivanti, ServiceNow</w:t>
+      </w:r>
+    </w:p>
+    <w:p>
+      <w:pPr>
+        <w:spacing w:after="20"/>
+      </w:pPr>
+      <w:r>
+        <w:rPr>
+          <w:b/>
+        </w:rPr>
+        <w:t xml:space="preserve">Infrastructure: </w:t>
+      </w:r>
+      <w:r>
+        <w:t>Hyper-V, SCVMM, Windows Admin Center, Proxmox, pfSense, OpenVPN, Linux</w:t>
+      </w:r>
+    </w:p>
+    <w:p>
+      <w:pPr>
+        <w:spacing w:after="20"/>
+      </w:pPr>
+      <w:r>
+        <w:rPr>
+          <w:b/>
+        </w:rPr>
+        <w:t xml:space="preserve">Automation: </w:t>
+      </w:r>
+      <w:r>
+        <w:t>PowerShell, Microsoft Graph, REST API reporting and administration</w:t>
+      </w:r>
+    </w:p>
+    <w:p>
+      <w:pPr>
+        <w:pStyle w:val="ResumeHeading"/>
+      </w:pPr>
+      <w:r>
+        <w:t>PROFESSIONAL EXPERIENCE</w:t>
+      </w:r>
+    </w:p>
+    <w:tbl>
+      <w:tblPr>
+        <w:tblW w:type="auto" w:w="0"/>
+        <w:jc w:val="center"/>
+        <w:tblLayout w:type="fixed"/>
+        <w:tblLook w:firstColumn="1" w:firstRow="1" w:lastColumn="0" w:lastRow="0" w:noHBand="0" w:noVBand="1" w:val="04A0"/>
+        <w:tblBorders>
+          <w:top w:val="nil"/>
+          <w:left w:val="nil"/>
+          <w:bottom w:val="nil"/>
+          <w:right w:val="nil"/>
+          <w:insideH w:val="nil"/>
+          <w:insideV w:val="nil"/>
+        </w:tblBorders>
+      </w:tblPr>
+      <w:tblGrid>
+        <w:gridCol w:w="8208"/>
+        <w:gridCol w:w="2160"/>
+      </w:tblGrid>
+      <w:tr>
+        <w:tc>
+          <w:tcPr>
+            <w:tcW w:type="dxa" w:w="5328"/>
+          </w:tcPr>
+          <w:p>
+            <w:pPr>
+              <w:pStyle w:val="ResumeRole"/>
+            </w:pPr>
+            <w:r>
+              <w:t>Service Desk Technician — Logicalis</w:t>
+            </w:r>
+          </w:p>
+        </w:tc>
+        <w:tc>
+          <w:tcPr>
+            <w:tcW w:type="dxa" w:w="5328"/>
+          </w:tcPr>
+          <w:p>
+            <w:pPr>
+              <w:jc w:val="right"/>
+            </w:pPr>
+            <w:r>
+              <w:rPr>
+                <w:b/>
+                <w:sz w:val="17"/>
+              </w:rPr>
+              <w:t>Apr 2024 – Present</w:t>
+            </w:r>
+          </w:p>
+        </w:tc>
+      </w:tr>
+    </w:tbl>
+    <w:p>
+      <w:pPr>
+        <w:spacing w:after="20"/>
+      </w:pPr>
+      <w:r>
+        <w:rPr>
+          <w:i/>
+          <w:sz w:val="17"/>
+        </w:rPr>
+        <w:t>MSP support for enterprise healthcare and industrial clients</w:t>
+      </w:r>
+    </w:p>
+    <w:p>
+      <w:pPr>
+        <w:spacing w:after="26"/>
+        <w:ind w:left="230" w:hanging="158"/>
+      </w:pPr>
+      <w:r>
+        <w:rPr>
+          <w:b/>
+        </w:rPr>
+        <w:t xml:space="preserve">• </w:t>
+      </w:r>
+      <w:r>
+        <w:t>Provide enterprise Service Desk support for Summa Health and additional MSP clients, including Windows, application, account, and connectivity troubleshooting.</w:t>
+      </w:r>
+    </w:p>
+    <w:p>
+      <w:pPr>
+        <w:spacing w:after="26"/>
+        <w:ind w:left="230" w:hanging="158"/>
+      </w:pPr>
+      <w:r>
+        <w:rPr>
+          <w:b/>
+        </w:rPr>
+        <w:t xml:space="preserve">• </w:t>
+      </w:r>
+      <w:r>
+        <w:t>Perform Active Directory account administration, password resets, new-user setup, permissions support, and identity-related troubleshooting within Service Desk scope.</w:t>
+      </w:r>
+    </w:p>
+    <w:p>
+      <w:pPr>
+        <w:spacing w:after="26"/>
+        <w:ind w:left="230" w:hanging="158"/>
+      </w:pPr>
+      <w:r>
+        <w:rPr>
+          <w:b/>
+        </w:rPr>
+        <w:t xml:space="preserve">• </w:t>
+      </w:r>
+      <w:r>
+        <w:t>Support healthcare applications and workflows including Epic, MyChart, Vocera, and Ivanti ticketing; document resolutions and escalate complex issues to Tier 2/3 teams.</w:t>
+      </w:r>
+    </w:p>
+    <w:p>
+      <w:pPr>
+        <w:spacing w:after="26"/>
+        <w:ind w:left="230" w:hanging="158"/>
+      </w:pPr>
+      <w:r>
+        <w:rPr>
+          <w:b/>
+        </w:rPr>
+        <w:t xml:space="preserve">• </w:t>
+      </w:r>
+      <w:r>
+        <w:t>Self-reported performance includes an average resolution time of 0.83 days, 85% of incidents resolved without reassignment, and 72% same-day resolution.</w:t>
+      </w:r>
+    </w:p>
+    <w:tbl>
+      <w:tblPr>
+        <w:tblW w:type="auto" w:w="0"/>
+        <w:jc w:val="center"/>
+        <w:tblLayout w:type="fixed"/>
+        <w:tblLook w:firstColumn="1" w:firstRow="1" w:lastColumn="0" w:lastRow="0" w:noHBand="0" w:noVBand="1" w:val="04A0"/>
+        <w:tblBorders>
+          <w:top w:val="nil"/>
+          <w:left w:val="nil"/>
+          <w:bottom w:val="nil"/>
+          <w:right w:val="nil"/>
+          <w:insideH w:val="nil"/>
+          <w:insideV w:val="nil"/>
+        </w:tblBorders>
+      </w:tblPr>
+      <w:tblGrid>
+        <w:gridCol w:w="8208"/>
+        <w:gridCol w:w="2160"/>
+      </w:tblGrid>
+      <w:tr>
+        <w:tc>
+          <w:tcPr>
+            <w:tcW w:type="dxa" w:w="5328"/>
+          </w:tcPr>
+          <w:p>
+            <w:pPr>
+              <w:pStyle w:val="ResumeRole"/>
+            </w:pPr>
+            <w:r>
+              <w:t>Service Desk Representative / Team Lead — Insight Global</w:t>
+            </w:r>
+          </w:p>
+        </w:tc>
+        <w:tc>
+          <w:tcPr>
+            <w:tcW w:type="dxa" w:w="5328"/>
+          </w:tcPr>
+          <w:p>
+            <w:pPr>
+              <w:jc w:val="right"/>
+            </w:pPr>
+            <w:r>
+              <w:rPr>
+                <w:b/>
+                <w:sz w:val="17"/>
+              </w:rPr>
+              <w:t>Oct 2022 – Jan 2024</w:t>
+            </w:r>
+          </w:p>
+        </w:tc>
+      </w:tr>
+    </w:tbl>
+    <w:p>
+      <w:pPr>
+        <w:spacing w:after="20"/>
+      </w:pPr>
+      <w:r>
+        <w:rPr>
+          <w:i/>
+          <w:sz w:val="17"/>
+        </w:rPr>
+        <w:t>Healthesystems service desk support</w:t>
+      </w:r>
+    </w:p>
+    <w:p>
+      <w:pPr>
+        <w:spacing w:after="26"/>
+        <w:ind w:left="230" w:hanging="158"/>
+      </w:pPr>
+      <w:r>
+        <w:rPr>
+          <w:b/>
+        </w:rPr>
+        <w:t xml:space="preserve">• </w:t>
+      </w:r>
+      <w:r>
+        <w:t>Provided end-user technical troubleshooting, ticket ownership, escalation support, and customer communication in a production support environment.</w:t>
+      </w:r>
+    </w:p>
+    <w:p>
+      <w:pPr>
+        <w:spacing w:after="26"/>
+        <w:ind w:left="230" w:hanging="158"/>
+      </w:pPr>
+      <w:r>
+        <w:rPr>
+          <w:b/>
+        </w:rPr>
+        <w:t xml:space="preserve">• </w:t>
+      </w:r>
+      <w:r>
+        <w:t>Supported team coordination and technician guidance while maintaining incident ownership and service-quality expectations.</w:t>
+      </w:r>
+    </w:p>
+    <w:tbl>
+      <w:tblPr>
+        <w:tblW w:type="auto" w:w="0"/>
+        <w:jc w:val="center"/>
+        <w:tblLayout w:type="fixed"/>
+        <w:tblLook w:firstColumn="1" w:firstRow="1" w:lastColumn="0" w:lastRow="0" w:noHBand="0" w:noVBand="1" w:val="04A0"/>
+        <w:tblBorders>
+          <w:top w:val="nil"/>
+          <w:left w:val="nil"/>
+          <w:bottom w:val="nil"/>
+          <w:right w:val="nil"/>
+          <w:insideH w:val="nil"/>
+          <w:insideV w:val="nil"/>
+        </w:tblBorders>
+      </w:tblPr>
+      <w:tblGrid>
+        <w:gridCol w:w="8208"/>
+        <w:gridCol w:w="2160"/>
+      </w:tblGrid>
+      <w:tr>
+        <w:tc>
+          <w:tcPr>
+            <w:tcW w:type="dxa" w:w="5328"/>
+          </w:tcPr>
+          <w:p>
+            <w:pPr>
+              <w:pStyle w:val="ResumeRole"/>
+            </w:pPr>
+            <w:r>
+              <w:t>IT Technician — Completeful Technologies</w:t>
+            </w:r>
+          </w:p>
+        </w:tc>
+        <w:tc>
+          <w:tcPr>
+            <w:tcW w:type="dxa" w:w="5328"/>
+          </w:tcPr>
+          <w:p>
+            <w:pPr>
+              <w:jc w:val="right"/>
+            </w:pPr>
+            <w:r>
+              <w:rPr>
+                <w:b/>
+                <w:sz w:val="17"/>
+              </w:rPr>
+              <w:t>Feb 2022 – Jun 2022</w:t>
+            </w:r>
+          </w:p>
+        </w:tc>
+      </w:tr>
+    </w:tbl>
+    <w:p>
+      <w:pPr>
+        <w:spacing w:after="20"/>
+      </w:pPr>
+      <w:r>
+        <w:rPr>
+          <w:i/>
+          <w:sz w:val="17"/>
+        </w:rPr>
+        <w:t>Sole IT administration and startup infrastructure deployment</w:t>
+      </w:r>
+    </w:p>
+    <w:p>
+      <w:pPr>
+        <w:spacing w:after="26"/>
+        <w:ind w:left="230" w:hanging="158"/>
+      </w:pPr>
+      <w:r>
+        <w:rPr>
+          <w:b/>
+        </w:rPr>
+        <w:t xml:space="preserve">• </w:t>
+      </w:r>
+      <w:r>
+        <w:t>Joined during the launch of a new drop-shipping company and served as the primary internal IT resource responsible for establishing its initial IT environment.</w:t>
+      </w:r>
+    </w:p>
+    <w:p>
+      <w:pPr>
+        <w:spacing w:after="26"/>
+        <w:ind w:left="230" w:hanging="158"/>
+      </w:pPr>
+      <w:r>
+        <w:rPr>
+          <w:b/>
+        </w:rPr>
+        <w:t xml:space="preserve">• </w:t>
+      </w:r>
+      <w:r>
+        <w:t>Built and configured the on-premises Windows infrastructure, including Windows Server and Active Directory Domain Services for centralized identity, authentication, users, groups, policy, and workstation integration.</w:t>
+      </w:r>
+    </w:p>
+    <w:p>
+      <w:pPr>
+        <w:spacing w:after="26"/>
+        <w:ind w:left="230" w:hanging="158"/>
+      </w:pPr>
+      <w:r>
+        <w:rPr>
+          <w:b/>
+        </w:rPr>
+        <w:t xml:space="preserve">• </w:t>
+      </w:r>
+      <w:r>
+        <w:t>Configured Cloudflare for authoritative DNS and domain services, and established the company’s Microsoft 365 environment for cloud productivity and identity-related business services.</w:t>
+      </w:r>
+    </w:p>
+    <w:p>
+      <w:pPr>
+        <w:spacing w:after="26"/>
+        <w:ind w:left="230" w:hanging="158"/>
+      </w:pPr>
+      <w:r>
+        <w:rPr>
+          <w:b/>
+        </w:rPr>
+        <w:t xml:space="preserve">• </w:t>
+      </w:r>
+      <w:r>
+        <w:t>Handled day-to-day IT administration and user support after rollout, covering endpoints, accounts, applications, access, and general technology needs across the organization.</w:t>
+      </w:r>
+    </w:p>
+    <w:tbl>
+      <w:tblPr>
+        <w:tblW w:type="auto" w:w="0"/>
+        <w:jc w:val="center"/>
+        <w:tblLayout w:type="fixed"/>
+        <w:tblLook w:firstColumn="1" w:firstRow="1" w:lastColumn="0" w:lastRow="0" w:noHBand="0" w:noVBand="1" w:val="04A0"/>
+        <w:tblBorders>
+          <w:top w:val="nil"/>
+          <w:left w:val="nil"/>
+          <w:bottom w:val="nil"/>
+          <w:right w:val="nil"/>
+          <w:insideH w:val="nil"/>
+          <w:insideV w:val="nil"/>
+        </w:tblBorders>
+      </w:tblPr>
+      <w:tblGrid>
+        <w:gridCol w:w="8208"/>
+        <w:gridCol w:w="2160"/>
+      </w:tblGrid>
+      <w:tr>
+        <w:tc>
+          <w:tcPr>
+            <w:tcW w:type="dxa" w:w="5328"/>
+          </w:tcPr>
+          <w:p>
+            <w:pPr>
+              <w:pStyle w:val="ResumeRole"/>
+            </w:pPr>
+            <w:r>
+              <w:t>Technical Support — Hughes Network Systems</w:t>
+            </w:r>
+          </w:p>
+        </w:tc>
+        <w:tc>
+          <w:tcPr>
+            <w:tcW w:type="dxa" w:w="5328"/>
+          </w:tcPr>
+          <w:p>
+            <w:pPr>
+              <w:jc w:val="right"/>
+            </w:pPr>
+            <w:r>
+              <w:rPr>
+                <w:b/>
+                <w:sz w:val="17"/>
+              </w:rPr>
+              <w:t>Sep 2021 – Feb 2022</w:t>
+            </w:r>
+          </w:p>
+        </w:tc>
+      </w:tr>
+    </w:tbl>
+    <w:p>
+      <w:pPr>
+        <w:spacing w:after="20"/>
+      </w:pPr>
+      <w:r>
+        <w:rPr>
+          <w:i/>
+          <w:sz w:val="17"/>
+        </w:rPr>
+        <w:t>Customer-facing connectivity and technical support</w:t>
+      </w:r>
+    </w:p>
+    <w:p>
+      <w:pPr>
+        <w:spacing w:after="26"/>
+        <w:ind w:left="230" w:hanging="158"/>
+      </w:pPr>
+      <w:r>
+        <w:rPr>
+          <w:b/>
+        </w:rPr>
+        <w:t xml:space="preserve">• </w:t>
+      </w:r>
+      <w:r>
+        <w:t>Troubleshot network connectivity, equipment, and service issues while guiding customers through technical resolution steps.</w:t>
+      </w:r>
+    </w:p>
+    <w:tbl>
+      <w:tblPr>
+        <w:tblW w:type="auto" w:w="0"/>
+        <w:jc w:val="center"/>
+        <w:tblLayout w:type="fixed"/>
+        <w:tblLook w:firstColumn="1" w:firstRow="1" w:lastColumn="0" w:lastRow="0" w:noHBand="0" w:noVBand="1" w:val="04A0"/>
+        <w:tblBorders>
+          <w:top w:val="nil"/>
+          <w:left w:val="nil"/>
+          <w:bottom w:val="nil"/>
+          <w:right w:val="nil"/>
+          <w:insideH w:val="nil"/>
+          <w:insideV w:val="nil"/>
+        </w:tblBorders>
+      </w:tblPr>
+      <w:tblGrid>
+        <w:gridCol w:w="8208"/>
+        <w:gridCol w:w="2160"/>
+      </w:tblGrid>
+      <w:tr>
+        <w:tc>
+          <w:tcPr>
+            <w:tcW w:type="dxa" w:w="5328"/>
+          </w:tcPr>
+          <w:p>
+            <w:pPr>
+              <w:pStyle w:val="ResumeRole"/>
+            </w:pPr>
+            <w:r>
+              <w:t>Help Desk — Remington College</w:t>
+            </w:r>
+          </w:p>
+        </w:tc>
+        <w:tc>
+          <w:tcPr>
+            <w:tcW w:type="dxa" w:w="5328"/>
+          </w:tcPr>
+          <w:p>
+            <w:pPr>
+              <w:jc w:val="right"/>
+            </w:pPr>
+            <w:r>
+              <w:rPr>
+                <w:b/>
+                <w:sz w:val="17"/>
+              </w:rPr>
+              <w:t>Dec 2019 – Apr 2021</w:t>
+            </w:r>
+          </w:p>
+        </w:tc>
+      </w:tr>
+    </w:tbl>
+    <w:p>
+      <w:pPr>
+        <w:spacing w:after="20"/>
+      </w:pPr>
+      <w:r>
+        <w:rPr>
+          <w:i/>
+          <w:sz w:val="17"/>
+        </w:rPr>
+        <w:t>Academic IT support</w:t>
+      </w:r>
+    </w:p>
+    <w:p>
+      <w:pPr>
+        <w:spacing w:after="26"/>
+        <w:ind w:left="230" w:hanging="158"/>
+      </w:pPr>
+      <w:r>
+        <w:rPr>
+          <w:b/>
+        </w:rPr>
+        <w:t xml:space="preserve">• </w:t>
+      </w:r>
+      <w:r>
+        <w:t>Provided user and endpoint support while completing an A.S. in Computer Science - Database Administration.</w:t>
+      </w:r>
+    </w:p>
+    <w:p>
+      <w:pPr>
+        <w:pStyle w:val="ResumeHeading"/>
+      </w:pPr>
+      <w:r>
+        <w:t>SELECTED SYSTEMS ADMINISTRATION PROJECTS</w:t>
+      </w:r>
+    </w:p>
+    <w:p>
+      <w:pPr>
+        <w:spacing w:after="26"/>
+        <w:ind w:left="230" w:hanging="158"/>
+      </w:pPr>
+      <w:r>
+        <w:rPr>
+          <w:b/>
+        </w:rPr>
+        <w:t xml:space="preserve">• </w:t>
+      </w:r>
+      <w:r>
+        <w:t>Windows LAPS &amp; Advanced Group Policy: schema extension, encrypted password backup, OU delegation, RSOP validation, negative access testing, and forced password rotation.</w:t>
+      </w:r>
+    </w:p>
+    <w:p>
+      <w:pPr>
+        <w:spacing w:after="26"/>
+        <w:ind w:left="230" w:hanging="158"/>
+      </w:pPr>
+      <w:r>
+        <w:rPr>
+          <w:b/>
+        </w:rPr>
+        <w:t xml:space="preserve">• </w:t>
+      </w:r>
+      <w:r>
+        <w:t>Microsoft Entra Hybrid Identity &amp; Cloud Sync: scoped AD-to-Entra provisioning, Password Hash Sync, source authority, agent health, and provisioning troubleshooting.</w:t>
+      </w:r>
+    </w:p>
+    <w:p>
+      <w:pPr>
+        <w:spacing w:after="26"/>
+        <w:ind w:left="230" w:hanging="158"/>
+      </w:pPr>
+      <w:r>
+        <w:rPr>
+          <w:b/>
+        </w:rPr>
+        <w:t xml:space="preserve">• </w:t>
+      </w:r>
+      <w:r>
+        <w:t>Windows Autopilot &amp; Intune MDM: user-driven Entra join, Enrollment Status Page, Microsoft 365 Apps, BitLocker, Defender, Secure Boot remediation, and compliance validation.</w:t>
+      </w:r>
+    </w:p>
+    <w:p>
+      <w:pPr>
+        <w:spacing w:after="26"/>
+        <w:ind w:left="230" w:hanging="158"/>
+      </w:pPr>
+      <w:r>
+        <w:rPr>
+          <w:b/>
+        </w:rPr>
+        <w:t xml:space="preserve">• </w:t>
+      </w:r>
+      <w:r>
+        <w:t>Microsoft 365 Graph Administration Lab: reusable PowerShell/Graph reporting for tenant inventory, users, groups, licensing, directory roles, stale accounts, and Intune devices.</w:t>
+      </w:r>
+    </w:p>
+    <w:p>
+      <w:pPr>
+        <w:pStyle w:val="ResumeHeading"/>
+      </w:pPr>
+      <w:r>
+        <w:t>EDUCATION</w:t>
       </w:r>
     </w:p>
     <w:p>
@@ -60,10 +720,10 @@
         <w:rPr>
           <w:b/>
         </w:rPr>
-        <w:t xml:space="preserve">Service Desk &amp; ITSM: </w:t>
+        <w:t>A.S. Computer Science - Database Administration, Remington College</w:t>
       </w:r>
       <w:r>
-        <w:t>Incident management, escalation management, ticket triage, ServiceNow, Ivanti, SLA compliance, knowledge management</w:t>
+        <w:t xml:space="preserve">  |  Aug 2019 - May 2021  |  GPA 3.84, Honors / Dean's List</w:t>
       </w:r>
     </w:p>
     <w:p>
@@ -71,229 +731,15 @@
         <w:rPr>
           <w:b/>
         </w:rPr>
-        <w:t xml:space="preserve">Microsoft 365 &amp; Identity: </w:t>
+        <w:t>Information Security &amp; Administration, MyComputerCareer</w:t>
       </w:r>
       <w:r>
-        <w:t>Microsoft 365, Entra ID exposure, Active Directory fundamentals, MFA support, Conditional Access concepts, account provisioning</w:t>
-      </w:r>
-    </w:p>
-    <w:p>
-      <w:r>
-        <w:rPr>
-          <w:b/>
-        </w:rPr>
-        <w:t xml:space="preserve">Endpoint &amp; Operating Systems: </w:t>
-      </w:r>
-      <w:r>
-        <w:t>Windows 10/11, Windows Server fundamentals, macOS, Linux, endpoint troubleshooting, system imaging, hardware/software support</w:t>
-      </w:r>
-    </w:p>
-    <w:p>
-      <w:r>
-        <w:rPr>
-          <w:b/>
-        </w:rPr>
-        <w:t xml:space="preserve">Infrastructure &amp; Networking: </w:t>
-      </w:r>
-      <w:r>
-        <w:t>DNS, DHCP, TCP/IP, VPN troubleshooting, VLAN fundamentals, firewall concepts, virtualization, backup and recovery validation</w:t>
-      </w:r>
-    </w:p>
-    <w:p>
-      <w:r>
-        <w:rPr>
-          <w:b/>
-        </w:rPr>
-        <w:t xml:space="preserve">Automation &amp; Documentation: </w:t>
-      </w:r>
-      <w:r>
-        <w:t>PowerShell, Git, runbooks, change management, validation checklists, RCA notes, operational handoff documentation</w:t>
+        <w:t xml:space="preserve">  |  Jun 2021 - Jan 2022  |  GPA 4.00, WCITP</w:t>
       </w:r>
     </w:p>
     <w:p>
       <w:pPr>
-        <w:pStyle w:val="Heading1"/>
-      </w:pPr>
-      <w:r>
-        <w:t>PROFESSIONAL EXPERIENCE</w:t>
-      </w:r>
-    </w:p>
-    <w:p>
-      <w:pPr>
-        <w:keepNext/>
-      </w:pPr>
-      <w:r>
-        <w:rPr>
-          <w:b/>
-          <w:sz w:val="17"/>
-        </w:rPr>
-        <w:t>Logicalis - Service Desk Technician (Vuori)</w:t>
-      </w:r>
-      <w:r>
-        <w:t xml:space="preserve"> | Apr 2024 - Present</w:t>
-      </w:r>
-    </w:p>
-    <w:p>
-      <w:pPr>
-        <w:pStyle w:val="ListBullet"/>
-      </w:pPr>
-      <w:r>
-        <w:t>Provide enterprise service desk support for Vuori users across Windows, macOS, Microsoft 365, SaaS, endpoint, and cloud-supported workflows while maintaining SLA-focused ticket ownership.</w:t>
-      </w:r>
-    </w:p>
-    <w:p>
-      <w:pPr>
-        <w:pStyle w:val="ListBullet"/>
-      </w:pPr>
-      <w:r>
-        <w:t>Resolve and escalate hardware, operating system, account access, application, and connectivity incidents with clear user communication, impact notes, and documented troubleshooting steps.</w:t>
-      </w:r>
-    </w:p>
-    <w:p>
-      <w:pPr>
-        <w:pStyle w:val="ListBullet"/>
-      </w:pPr>
-      <w:r>
-        <w:t>Support Microsoft 365 and Entra ID related requests including account provisioning, permissions review, MFA support, and identity-access workflow documentation.</w:t>
-      </w:r>
-    </w:p>
-    <w:p>
-      <w:pPr>
-        <w:pStyle w:val="ListBullet"/>
-      </w:pPr>
-      <w:r>
-        <w:t>Strengthen knowledge management by recording repeatable fixes, escalation context, service request details, and support handoff notes for higher-tier resolver teams.</w:t>
-      </w:r>
-    </w:p>
-    <w:p>
-      <w:pPr>
-        <w:keepNext/>
-      </w:pPr>
-      <w:r>
-        <w:rPr>
-          <w:b/>
-          <w:sz w:val="17"/>
-        </w:rPr>
-        <w:t>Insight Global - Service Desk Representative / Team Lead</w:t>
-      </w:r>
-      <w:r>
-        <w:t xml:space="preserve"> | Oct 2022 - Jan 2024</w:t>
-      </w:r>
-    </w:p>
-    <w:p>
-      <w:pPr>
-        <w:pStyle w:val="ListBullet"/>
-      </w:pPr>
-      <w:r>
-        <w:t>Led daily service desk activity across enterprise support queues, coordinating triage, escalation routing, technician workflow, and customer-service expectations.</w:t>
-      </w:r>
-    </w:p>
-    <w:p>
-      <w:pPr>
-        <w:pStyle w:val="ListBullet"/>
-      </w:pPr>
-      <w:r>
-        <w:t>Improved ticket handling consistency by reinforcing SLA discipline, documentation quality, queue awareness, and repeatable troubleshooting procedures.</w:t>
-      </w:r>
-    </w:p>
-    <w:p>
-      <w:pPr>
-        <w:pStyle w:val="ListBullet"/>
-      </w:pPr>
-      <w:r>
-        <w:t>Served as an escalation point for complex support incidents and coached technicians on support standards, ticket documentation, and service delivery procedures.</w:t>
-      </w:r>
-    </w:p>
-    <w:p>
-      <w:pPr>
-        <w:keepNext/>
-      </w:pPr>
-      <w:r>
-        <w:rPr>
-          <w:b/>
-          <w:sz w:val="17"/>
-        </w:rPr>
-        <w:t>Completeful Technologies LLC - IT Technician</w:t>
-      </w:r>
-      <w:r>
-        <w:t xml:space="preserve"> | Feb 2022 - Jun 2022</w:t>
-      </w:r>
-    </w:p>
-    <w:p>
-      <w:pPr>
-        <w:pStyle w:val="ListBullet"/>
-      </w:pPr>
-      <w:r>
-        <w:t>Supported Windows and Linux endpoints, hardware, software, and routine maintenance tasks in a hands-on technical support environment.</w:t>
-      </w:r>
-    </w:p>
-    <w:p>
-      <w:pPr>
-        <w:pStyle w:val="ListBullet"/>
-      </w:pPr>
-      <w:r>
-        <w:t>Assisted with Active Directory administration, endpoint management, device troubleshooting, and operational support activities under appropriate guidance.</w:t>
-      </w:r>
-    </w:p>
-    <w:p>
-      <w:pPr>
-        <w:pStyle w:val="Heading1"/>
-      </w:pPr>
-      <w:r>
-        <w:t>SYSTEMS ADMINISTRATION &amp; INFRASTRUCTURE VALIDATION</w:t>
-      </w:r>
-    </w:p>
-    <w:p>
-      <w:pPr>
-        <w:pStyle w:val="ListBullet"/>
-      </w:pPr>
-      <w:r>
-        <w:t>Microsoft 365 and Entra ID lab records document identity boundaries, Conditional Access intent, endpoint policy planning, and tenant-safe administration workflows.</w:t>
-      </w:r>
-    </w:p>
-    <w:p>
-      <w:pPr>
-        <w:pStyle w:val="ListBullet"/>
-      </w:pPr>
-      <w:r>
-        <w:t>Active Directory and Windows Server lab documentation covers users, groups, OU planning, DNS/DHCP concepts, Group Policy fundamentals, and virtualization review paths.</w:t>
-      </w:r>
-    </w:p>
-    <w:p>
-      <w:pPr>
-        <w:pStyle w:val="ListBullet"/>
-      </w:pPr>
-      <w:r>
-        <w:t>Infrastructure operations artifacts cover runbooks, monitoring concepts, backup/recovery validation, change notes, operational readiness, and escalation-aware handoff.</w:t>
-      </w:r>
-    </w:p>
-    <w:p>
-      <w:pPr>
-        <w:pStyle w:val="Heading1"/>
-      </w:pPr>
-      <w:r>
-        <w:t>EDUCATION</w:t>
-      </w:r>
-    </w:p>
-    <w:p>
-      <w:pPr>
-        <w:pStyle w:val="ListBullet"/>
-      </w:pPr>
-      <w:r>
-        <w:t>Information Security &amp; Administration, MyComputerCareer - GPA: 4.0</w:t>
-      </w:r>
-    </w:p>
-    <w:p>
-      <w:pPr>
-        <w:pStyle w:val="ListBullet"/>
-      </w:pPr>
-      <w:r>
-        <w:t>Associate of Science, Computer Science - Database Administration, Remington College - Graduated with Honors</w:t>
-      </w:r>
-    </w:p>
-    <w:p>
-      <w:pPr>
-        <w:pStyle w:val="Heading1"/>
+        <w:pStyle w:val="ResumeHeading"/>
       </w:pPr>
       <w:r>
         <w:t>CERTIFICATIONS</w:t>
@@ -301,20 +747,7 @@
     </w:p>
     <w:p>
       <w:r>
-        <w:t>CompTIA A+ | CompTIA Server+ | CompTIA ITF+ | Microsoft Azure Fundamentals (AZ-900) | MTA Networking Fundamentals | MTA Security Fundamentals | MTA Windows Server Administration Fundamentals | Linux Essentials | Google IT Support Professional Certificate</w:t>
-      </w:r>
-    </w:p>
-    <w:p>
-      <w:pPr>
-        <w:pStyle w:val="Heading1"/>
-      </w:pPr>
-      <w:r>
-        <w:t>AWARDS</w:t>
-      </w:r>
-    </w:p>
-    <w:p>
-      <w:r>
-        <w:t>World Class IT Professional (WCITP), MyComputerCareer - recognized for academic achievement, technical proficiency, professionalism, and leadership.</w:t>
+        <w:t>Microsoft Azure Fundamentals; CompTIA ITF+, A+, Server+; MTA Windows Server Administration Fundamentals; MTA Networking Fundamentals; MTA Security Fundamentals; LPI Linux Essentials; Google IT Support; Cisco Introduction to Cybersecurity; freeCodeCamp Responsive Web Design</w:t>
       </w:r>
     </w:p>
     <w:sectPr>
@@ -691,11 +1124,11 @@
     <w:qFormat/>
     <w:rsid w:val="00FC693F"/>
     <w:pPr>
-      <w:spacing w:after="34" w:line="240" w:lineRule="auto"/>
+      <w:spacing w:after="44"/>
     </w:pPr>
     <w:rPr>
-      <w:rFonts w:ascii="Arial" w:hAnsi="Arial" w:eastAsia="Arial"/>
-      <w:sz w:val="17"/>
+      <w:rFonts w:ascii="Aptos" w:hAnsi="Aptos"/>
+      <w:sz w:val="18"/>
     </w:rPr>
   </w:style>
   <w:style w:type="paragraph" w:styleId="Header">
@@ -753,15 +1186,15 @@
     <w:pPr>
       <w:keepNext/>
       <w:keepLines/>
-      <w:spacing w:before="72" w:after="28"/>
+      <w:spacing w:before="480" w:after="0"/>
       <w:outlineLvl w:val="0"/>
     </w:pPr>
     <w:rPr>
-      <w:rFonts w:asciiTheme="majorHAnsi" w:eastAsiaTheme="majorEastAsia" w:hAnsiTheme="majorHAnsi" w:cstheme="majorBidi" w:ascii="Arial" w:hAnsi="Arial" w:eastAsia="Arial"/>
+      <w:rFonts w:asciiTheme="majorHAnsi" w:eastAsiaTheme="majorEastAsia" w:hAnsiTheme="majorHAnsi" w:cstheme="majorBidi"/>
       <w:b/>
       <w:bCs/>
-      <w:color w:val="0BA8D8"/>
-      <w:sz w:val="20"/>
+      <w:color w:val="365F91" w:themeColor="accent1" w:themeShade="BF"/>
+      <w:sz w:val="28"/>
       <w:szCs w:val="28"/>
     </w:rPr>
   </w:style>
@@ -781,10 +1214,10 @@
       <w:outlineLvl w:val="1"/>
     </w:pPr>
     <w:rPr>
-      <w:rFonts w:asciiTheme="majorHAnsi" w:eastAsiaTheme="majorEastAsia" w:hAnsiTheme="majorHAnsi" w:cstheme="majorBidi" w:ascii="Arial" w:hAnsi="Arial" w:eastAsia="Arial"/>
+      <w:rFonts w:asciiTheme="majorHAnsi" w:eastAsiaTheme="majorEastAsia" w:hAnsiTheme="majorHAnsi" w:cstheme="majorBidi"/>
       <w:b/>
       <w:bCs/>
-      <w:color w:val="0BA8D8"/>
+      <w:color w:val="4F81BD" w:themeColor="accent1"/>
       <w:sz w:val="26"/>
       <w:szCs w:val="26"/>
     </w:rPr>
@@ -1224,14 +1657,8 @@
       <w:numPr>
         <w:numId w:val="1"/>
       </w:numPr>
-      <w:spacing w:after="12" w:line="230" w:lineRule="auto"/>
-      <w:ind w:left="230" w:hanging="230"/>
       <w:contextualSpacing/>
     </w:pPr>
-    <w:rPr>
-      <w:rFonts w:ascii="Arial" w:hAnsi="Arial"/>
-      <w:sz w:val="16"/>
-    </w:rPr>
   </w:style>
   <w:style w:type="paragraph" w:styleId="ListBullet2">
     <w:name w:val="List Bullet 2"/>
@@ -12385,6 +12812,42 @@
         <w:shd w:val="clear" w:color="auto" w:fill="FBCAA2" w:themeFill="accent6" w:themeFillTint="7F"/>
       </w:tcPr>
     </w:tblStylePr>
+  </w:style>
+  <w:style w:type="paragraph" w:customStyle="1" w:styleId="ResumeName">
+    <w:name w:val="Resume Name"/>
+    <w:pPr>
+      <w:spacing w:before="0" w:after="20"/>
+    </w:pPr>
+    <w:rPr>
+      <w:rFonts w:ascii="Aptos" w:hAnsi="Aptos"/>
+      <w:b/>
+      <w:color w:val="172033"/>
+      <w:sz w:val="40"/>
+    </w:rPr>
+  </w:style>
+  <w:style w:type="paragraph" w:customStyle="1" w:styleId="ResumeHeading">
+    <w:name w:val="Resume Heading"/>
+    <w:pPr>
+      <w:spacing w:before="120" w:after="40"/>
+    </w:pPr>
+    <w:rPr>
+      <w:rFonts w:ascii="Aptos" w:hAnsi="Aptos"/>
+      <w:b/>
+      <w:color w:val="1F4E79"/>
+      <w:sz w:val="21"/>
+    </w:rPr>
+  </w:style>
+  <w:style w:type="paragraph" w:customStyle="1" w:styleId="ResumeRole">
+    <w:name w:val="Resume Role"/>
+    <w:pPr>
+      <w:spacing w:before="60" w:after="0"/>
+    </w:pPr>
+    <w:rPr>
+      <w:rFonts w:ascii="Aptos" w:hAnsi="Aptos"/>
+      <w:b/>
+      <w:color w:val="172033"/>
+      <w:sz w:val="20"/>
+    </w:rPr>
   </w:style>
 </w:styles>
 </file>

</xml_diff>